<commit_message>
docs(examples): close run/paragraph showcase coverage gaps
Demonstrate the last fallback-supported keys that the .md tables claimed but the
.sh did not exercise:

- run-formatting: snapToGrid (explicit run, since it is also a paragraph prop)
  and specVanish — the .md long-tail list already named both
- paragraph-formatting: divId and textboxTightWrap (web/textbox layout hints)

Skipped intentionally: cnfStyle (conditional-format bitmask, complex) and
font.hint (rFonts attribute, not reachable by the child-element fallback).
Both .docx regenerate and validate clean; new keys confirmed via query.
</commit_message>
<xml_diff>
--- a/examples/word/paragraph-formatting.docx
+++ b/examples/word/paragraph-formatting.docx
@@ -760,6 +760,29 @@
       <w:r>
         <w:rPr/>
         <w:t xml:space="preserve">mirrorIndents on, adjustRightInd off, snapToGrid off</w:t>
+      </w:r>
+    </w:p>
+    <w:p>
+      <w:pPr>
+        <w:spacing w:before="200"/>
+      </w:pPr>
+      <w:r>
+        <w:rPr>
+          <w:b/>
+          <w:color w:val="1F4E79"/>
+          <w:sz w:val="28"/>
+        </w:rPr>
+        <w:t xml:space="preserve">Web / textbox hints</w:t>
+      </w:r>
+    </w:p>
+    <w:p>
+      <w:pPr>
+        <w:textboxTightWrap xmlns:w="http://schemas.openxmlformats.org/wordprocessingml/2006/main" w:val="allLines"/>
+        <w:divId xmlns:w="http://schemas.openxmlformats.org/wordprocessingml/2006/main" w:val="123456"/>
+      </w:pPr>
+      <w:r>
+        <w:rPr/>
+        <w:t xml:space="preserve">divId (web division id) + textboxTightWrap=allLines</w:t>
       </w:r>
     </w:p>
     <w:p>

</xml_diff>